<commit_message>
fix(test fixtures): styled-family — vrais Heading 1/2 reconnus par OO
Les définitions de style étaient minimales : OO ne promouvait pas Heading1/2
en vrais titres (pas de niveau, absents de la galerie ; boîte de style = « No
spacing »). Ajout du contrat canonique Word : qFormat, uiPriority, next, style
caractère lié (Heading1Char/Heading2Char) + DefaultParagraphFont, keepNext/Lines.
GetStyle().GetName() reste « Heading 1 »/« Heading 2 » → aucun golden/meta à
toucher. Validé live : boîte de style affiche bien Heading 1 / Heading 2.
</commit_message>
<xml_diff>
--- a/test-harness/fixtures/styled-family.docx
+++ b/test-harness/fixtures/styled-family.docx
@@ -30,15 +30,39 @@
 
 <file path=word/styles.xml><?xml version="1.0" encoding="utf-8"?>
 <w:styles xmlns:w="http://schemas.openxmlformats.org/wordprocessingml/2006/main">
+  <w:style w:type="character" w:default="1" w:styleId="DefaultParagraphFont">
+    <w:name w:val="Default Paragraph Font"/>
+    <w:uiPriority w:val="1"/>
+    <w:semiHidden/>
+    <w:unhideWhenUsed/>
+  </w:style>
   <w:style w:type="paragraph" w:default="1" w:styleId="Normal">
     <w:name w:val="Normal"/>
+    <w:qFormat/>
   </w:style>
   <w:style w:type="paragraph" w:styleId="Heading1">
     <w:name w:val="heading 1"/>
     <w:basedOn w:val="Normal"/>
+    <w:next w:val="Normal"/>
+    <w:link w:val="Heading1Char"/>
+    <w:uiPriority w:val="9"/>
+    <w:qFormat/>
     <w:pPr>
+      <w:keepNext/>
+      <w:keepLines/>
+      <w:spacing w:before="240" w:after="0"/>
       <w:outlineLvl w:val="0"/>
     </w:pPr>
+    <w:rPr>
+      <w:b/>
+      <w:sz w:val="32"/>
+    </w:rPr>
+  </w:style>
+  <w:style w:type="character" w:styleId="Heading1Char">
+    <w:name w:val="Heading 1 Char"/>
+    <w:basedOn w:val="DefaultParagraphFont"/>
+    <w:link w:val="Heading1"/>
+    <w:uiPriority w:val="9"/>
     <w:rPr>
       <w:b/>
       <w:sz w:val="32"/>
@@ -47,7 +71,14 @@
   <w:style w:type="paragraph" w:styleId="Heading2">
     <w:name w:val="heading 2"/>
     <w:basedOn w:val="Normal"/>
+    <w:next w:val="Normal"/>
+    <w:link w:val="Heading2Char"/>
+    <w:uiPriority w:val="9"/>
+    <w:qFormat/>
     <w:pPr>
+      <w:keepNext/>
+      <w:keepLines/>
+      <w:spacing w:before="240" w:after="0"/>
       <w:outlineLvl w:val="1"/>
     </w:pPr>
     <w:rPr>
@@ -55,5 +86,15 @@
       <w:sz w:val="28"/>
     </w:rPr>
   </w:style>
+  <w:style w:type="character" w:styleId="Heading2Char">
+    <w:name w:val="Heading 2 Char"/>
+    <w:basedOn w:val="DefaultParagraphFont"/>
+    <w:link w:val="Heading2"/>
+    <w:uiPriority w:val="9"/>
+    <w:rPr>
+      <w:b/>
+      <w:sz w:val="28"/>
+    </w:rPr>
+  </w:style>
 </w:styles>
 </file>
</xml_diff>